<commit_message>
Added and rewrote third and fourth topics
</commit_message>
<xml_diff>
--- a/КУРСОВАЯ_ООП/3_подраздел.docx
+++ b/КУРСОВАЯ_ООП/3_подраздел.docx
@@ -8,7 +8,7 @@
         <w:keepNext/>
         <w:numPr>
           <w:ilvl w:val="0"/>
-          <w:numId w:val="13"/>
+          <w:numId w:val="14"/>
         </w:numPr>
       </w:pPr>
       <w:r>
@@ -35,7 +35,19 @@
         <w:t>игру, в</w:t>
       </w:r>
       <w:r>
-        <w:t xml:space="preserve"> которой необходимо составлять слова с помощью букв на квадратном поле. Слова должны быть реальными, не используя аббревиатур</w:t>
+        <w:t xml:space="preserve"> которой необходимо составлять слова с помощью букв на квадратном поле</w:t>
+      </w:r>
+      <w:r>
+        <w:t> 5 на 5</w:t>
+      </w:r>
+      <w:r>
+        <w:t xml:space="preserve">. </w:t>
+      </w:r>
+      <w:r>
+        <w:t>Основной задачей является создание максимального количества слов, допустимых приложением, то есть с</w:t>
+      </w:r>
+      <w:r>
+        <w:t>лова должны быть реальными, не используя аббревиатур</w:t>
       </w:r>
       <w:r>
         <w:t xml:space="preserve"> и </w:t>
@@ -46,26 +58,151 @@
     </w:p>
     <w:p>
       <w:r>
-        <w:t xml:space="preserve">Целевой аудиторией </w:t>
-      </w:r>
-      <w:r>
-        <w:t xml:space="preserve">являются семейные пары, компании друзей, знакомых, </w:t>
-      </w:r>
-      <w:r>
-        <w:t>желающие провести время с пользой. Пользователи используют один общий компьютер, с помощью которого происходит весь процесс игры.</w:t>
+        <w:t>Целевой аудиторией являются семейные пары, компании друзей, знакомых</w:t>
+      </w:r>
+      <w:r>
+        <w:t>, образовательных учреждений, филологам, любителям кроссвордов</w:t>
+      </w:r>
+      <w:r>
+        <w:t xml:space="preserve">. Пользователи используют один общий компьютер, </w:t>
+      </w:r>
+      <w:r>
+        <w:t xml:space="preserve">мышь и клавиатуру, </w:t>
+      </w:r>
+      <w:r>
+        <w:t>с помощью котор</w:t>
+      </w:r>
+      <w:r>
+        <w:t>ых</w:t>
+      </w:r>
+      <w:r>
+        <w:t xml:space="preserve"> происходит весь процесс игры.</w:t>
+      </w:r>
+      <w:r>
+        <w:t xml:space="preserve"> Поддерживается исключительно полноэкранный режим.</w:t>
       </w:r>
     </w:p>
     <w:p>
       <w:r>
-        <w:t>«Балда» состоит из игрового поля 5 на 5, в центре поля записывается исходно слово из пяти букв, далее игроки (от двух до пяти) добавляют на поле по одной букве, чтобы получилось слово. Игра заканчивается, когда на поле или не остаётся свободного места, или нельзя сформировать слово.</w:t>
+        <w:t xml:space="preserve">Целью </w:t>
+      </w:r>
+      <w:r>
+        <w:t>пользователей</w:t>
+      </w:r>
+      <w:r>
+        <w:t xml:space="preserve"> является составление максимального количества слов, используя представленные буквы на поле. </w:t>
+      </w:r>
+      <w:r>
+        <w:t>В процессе игры пользователи развивают креативное мышление, логику, улучшают знания языка, путём развития словарного запаса.</w:t>
       </w:r>
     </w:p>
     <w:p>
       <w:r>
-        <w:t xml:space="preserve">Целью приложения является составление максимального количества слов, используя представленные буквы на поле. </w:t>
-      </w:r>
-      <w:r>
-        <w:t>В процессе игры пользователи развивают креативное мышление, логику, улучшают знания языка, путём развития словарного запаса.</w:t>
+        <w:t>Предметом автоматизации является автоматизация игрового процесса, то есть управление последовательностью ходов пользователей, проверка существования слов, подсчёт очков. Поддержка одиночного и многопользовательского режимов.</w:t>
+      </w:r>
+    </w:p>
+    <w:p>
+      <w:r>
+        <w:t>Пользовательские сценарии:</w:t>
+      </w:r>
+    </w:p>
+    <w:p>
+      <w:pPr>
+        <w:pStyle w:val="a0"/>
+      </w:pPr>
+      <w:r>
+        <w:t>Начало игры с выбор</w:t>
+      </w:r>
+      <w:r>
+        <w:t>ом</w:t>
+      </w:r>
+      <w:r>
+        <w:t xml:space="preserve"> количества игроков</w:t>
+      </w:r>
+      <w:r>
+        <w:t>.</w:t>
+      </w:r>
+    </w:p>
+    <w:p>
+      <w:pPr>
+        <w:pStyle w:val="a0"/>
+      </w:pPr>
+      <w:r>
+        <w:t>Формирование начального слова случайным игроком</w:t>
+      </w:r>
+      <w:r>
+        <w:t>.</w:t>
+      </w:r>
+    </w:p>
+    <w:p>
+      <w:pPr>
+        <w:pStyle w:val="a0"/>
+      </w:pPr>
+      <w:r>
+        <w:t>Последовательное введение букв поочерёдно пользователями</w:t>
+      </w:r>
+      <w:r>
+        <w:t>.</w:t>
+      </w:r>
+    </w:p>
+    <w:p>
+      <w:pPr>
+        <w:pStyle w:val="a0"/>
+      </w:pPr>
+      <w:r>
+        <w:t>Проверка существования полученного слова</w:t>
+      </w:r>
+      <w:r>
+        <w:t>.</w:t>
+      </w:r>
+    </w:p>
+    <w:p>
+      <w:pPr>
+        <w:pStyle w:val="a0"/>
+      </w:pPr>
+      <w:r>
+        <w:t>Просмотр текущей статистики</w:t>
+      </w:r>
+      <w:r>
+        <w:t>.</w:t>
+      </w:r>
+    </w:p>
+    <w:p>
+      <w:pPr>
+        <w:pStyle w:val="a0"/>
+      </w:pPr>
+      <w:r>
+        <w:t>Настройки параметров приложения.</w:t>
+      </w:r>
+    </w:p>
+    <w:p>
+      <w:r>
+        <w:t xml:space="preserve">Более подробно описывая, получим, что игра </w:t>
+      </w:r>
+      <w:r>
+        <w:t xml:space="preserve">«Балда» состоит из игрового поля 5 на 5, в центре поля записывается исходно слово из пяти букв, которое выделено жирным шрифтом, чтобы выделялось на фоне </w:t>
+      </w:r>
+      <w:r>
+        <w:lastRenderedPageBreak/>
+        <w:t>остальных, далее игроки (от двух до пяти) добавляют на поле по одной букве, чтобы получилось слово. Игра заканчивается, когда на поле или не остаётся свободного места, или нельзя сформировать слово.</w:t>
+      </w:r>
+    </w:p>
+    <w:p>
+      <w:r>
+        <w:t>При запуске приложения перед пользователем появляется окно, в котором на выбор представлены кнопки: «Запуск» и «Настройки». В настройках приложения пользователь регулирует размер поля, а также громкость музыкального сопровождения. Снизу сбоку будет поставлена кнопка, нажав на которую, пользователя перебрасывает в браузер в текстовой документ, в котором представлены все допустимые слова.</w:t>
+      </w:r>
+    </w:p>
+    <w:p>
+      <w:r>
+        <w:t>Нажав на кнопку запуска, пользователь попадает в следующее окно, в котором необходимо указать количество игроков, внести их имена или псевдонимы, а также зеленая кнопка «запуск». Оказавшись на игровом поле, случайным образом определяется игрок, который начнёт игру, написав первое слово по горизонтали на поле. Далее идёт порядок, как при внесении игроков, начиная с выбранного участника. Пример: три игрока, назовём их Андрей, Василий, Михаил. Оказавшись на поле, случайным образом выбирается пользователь Василий, который вписывает слово. Далее порядок идёт: Михаил – Андрей – Василий, затем по кругу.</w:t>
+      </w:r>
+    </w:p>
+    <w:p>
+      <w:r>
+        <w:t>За каждую букву, внесенную пользователем, не учитывая первого слова, начисляется по 5 очков. Справа сбоку будет представлена таблица подсчёта очков. По окончании игры статистика с игры будет автоматически удалена, следовательно в дальнейшем информация будет недоступна. После добавления буквы игроком, её изменение или удаление в дальнейшем невозможно</w:t>
+      </w:r>
+      <w:r>
+        <w:t>.</w:t>
       </w:r>
     </w:p>
     <w:sectPr>
@@ -428,6 +565,95 @@
     </w:lvl>
   </w:abstractNum>
   <w:abstractNum w:abstractNumId="3" w15:restartNumberingAfterBreak="0">
+    <w:nsid w:val="363F50AF"/>
+    <w:multiLevelType w:val="hybridMultilevel"/>
+    <w:tmpl w:val="25E4E15E"/>
+    <w:lvl w:ilvl="0" w:tplc="63BC9E4A">
+      <w:start w:val="3"/>
+      <w:numFmt w:val="decimal"/>
+      <w:lvlText w:val="%1"/>
+      <w:lvlJc w:val="left"/>
+      <w:pPr>
+        <w:ind w:left="720" w:hanging="360"/>
+      </w:pPr>
+      <w:rPr>
+        <w:rFonts w:hint="default"/>
+      </w:rPr>
+    </w:lvl>
+    <w:lvl w:ilvl="1" w:tplc="04190019" w:tentative="1">
+      <w:start w:val="1"/>
+      <w:numFmt w:val="lowerLetter"/>
+      <w:lvlText w:val="%2."/>
+      <w:lvlJc w:val="left"/>
+      <w:pPr>
+        <w:ind w:left="1440" w:hanging="360"/>
+      </w:pPr>
+    </w:lvl>
+    <w:lvl w:ilvl="2" w:tplc="0419001B" w:tentative="1">
+      <w:start w:val="1"/>
+      <w:numFmt w:val="lowerRoman"/>
+      <w:lvlText w:val="%3."/>
+      <w:lvlJc w:val="right"/>
+      <w:pPr>
+        <w:ind w:left="2160" w:hanging="180"/>
+      </w:pPr>
+    </w:lvl>
+    <w:lvl w:ilvl="3" w:tplc="0419000F" w:tentative="1">
+      <w:start w:val="1"/>
+      <w:numFmt w:val="decimal"/>
+      <w:lvlText w:val="%4."/>
+      <w:lvlJc w:val="left"/>
+      <w:pPr>
+        <w:ind w:left="2880" w:hanging="360"/>
+      </w:pPr>
+    </w:lvl>
+    <w:lvl w:ilvl="4" w:tplc="04190019" w:tentative="1">
+      <w:start w:val="1"/>
+      <w:numFmt w:val="lowerLetter"/>
+      <w:lvlText w:val="%5."/>
+      <w:lvlJc w:val="left"/>
+      <w:pPr>
+        <w:ind w:left="3600" w:hanging="360"/>
+      </w:pPr>
+    </w:lvl>
+    <w:lvl w:ilvl="5" w:tplc="0419001B" w:tentative="1">
+      <w:start w:val="1"/>
+      <w:numFmt w:val="lowerRoman"/>
+      <w:lvlText w:val="%6."/>
+      <w:lvlJc w:val="right"/>
+      <w:pPr>
+        <w:ind w:left="4320" w:hanging="180"/>
+      </w:pPr>
+    </w:lvl>
+    <w:lvl w:ilvl="6" w:tplc="0419000F" w:tentative="1">
+      <w:start w:val="1"/>
+      <w:numFmt w:val="decimal"/>
+      <w:lvlText w:val="%7."/>
+      <w:lvlJc w:val="left"/>
+      <w:pPr>
+        <w:ind w:left="5040" w:hanging="360"/>
+      </w:pPr>
+    </w:lvl>
+    <w:lvl w:ilvl="7" w:tplc="04190019" w:tentative="1">
+      <w:start w:val="1"/>
+      <w:numFmt w:val="lowerLetter"/>
+      <w:lvlText w:val="%8."/>
+      <w:lvlJc w:val="left"/>
+      <w:pPr>
+        <w:ind w:left="5760" w:hanging="360"/>
+      </w:pPr>
+    </w:lvl>
+    <w:lvl w:ilvl="8" w:tplc="0419001B" w:tentative="1">
+      <w:start w:val="1"/>
+      <w:numFmt w:val="lowerRoman"/>
+      <w:lvlText w:val="%9."/>
+      <w:lvlJc w:val="right"/>
+      <w:pPr>
+        <w:ind w:left="6480" w:hanging="180"/>
+      </w:pPr>
+    </w:lvl>
+  </w:abstractNum>
+  <w:abstractNum w:abstractNumId="4" w15:restartNumberingAfterBreak="0">
     <w:nsid w:val="376A29B9"/>
     <w:multiLevelType w:val="hybridMultilevel"/>
     <w:tmpl w:val="20384FFA"/>
@@ -516,7 +742,7 @@
       </w:pPr>
     </w:lvl>
   </w:abstractNum>
-  <w:abstractNum w:abstractNumId="4" w15:restartNumberingAfterBreak="0">
+  <w:abstractNum w:abstractNumId="5" w15:restartNumberingAfterBreak="0">
     <w:nsid w:val="3A30129C"/>
     <w:multiLevelType w:val="hybridMultilevel"/>
     <w:tmpl w:val="2676E6B6"/>
@@ -629,7 +855,7 @@
       </w:rPr>
     </w:lvl>
   </w:abstractNum>
-  <w:abstractNum w:abstractNumId="5" w15:restartNumberingAfterBreak="0">
+  <w:abstractNum w:abstractNumId="6" w15:restartNumberingAfterBreak="0">
     <w:nsid w:val="3C676D85"/>
     <w:multiLevelType w:val="hybridMultilevel"/>
     <w:tmpl w:val="E4AA005A"/>
@@ -742,7 +968,7 @@
       </w:rPr>
     </w:lvl>
   </w:abstractNum>
-  <w:abstractNum w:abstractNumId="6" w15:restartNumberingAfterBreak="0">
+  <w:abstractNum w:abstractNumId="7" w15:restartNumberingAfterBreak="0">
     <w:nsid w:val="416D2486"/>
     <w:multiLevelType w:val="hybridMultilevel"/>
     <w:tmpl w:val="D6086D56"/>
@@ -855,7 +1081,7 @@
       </w:rPr>
     </w:lvl>
   </w:abstractNum>
-  <w:abstractNum w:abstractNumId="7" w15:restartNumberingAfterBreak="0">
+  <w:abstractNum w:abstractNumId="8" w15:restartNumberingAfterBreak="0">
     <w:nsid w:val="68A97717"/>
     <w:multiLevelType w:val="multilevel"/>
     <w:tmpl w:val="AD2C26CA"/>
@@ -979,7 +1205,7 @@
       </w:rPr>
     </w:lvl>
   </w:abstractNum>
-  <w:abstractNum w:abstractNumId="8" w15:restartNumberingAfterBreak="0">
+  <w:abstractNum w:abstractNumId="9" w15:restartNumberingAfterBreak="0">
     <w:nsid w:val="69400935"/>
     <w:multiLevelType w:val="multilevel"/>
     <w:tmpl w:val="258A7D1E"/>
@@ -1127,7 +1353,7 @@
       </w:rPr>
     </w:lvl>
   </w:abstractNum>
-  <w:abstractNum w:abstractNumId="9" w15:restartNumberingAfterBreak="0">
+  <w:abstractNum w:abstractNumId="10" w15:restartNumberingAfterBreak="0">
     <w:nsid w:val="7C786116"/>
     <w:multiLevelType w:val="multilevel"/>
     <w:tmpl w:val="17C0655A"/>
@@ -1242,13 +1468,13 @@
     </w:lvl>
   </w:abstractNum>
   <w:num w:numId="1">
-    <w:abstractNumId w:val="8"/>
+    <w:abstractNumId w:val="9"/>
   </w:num>
   <w:num w:numId="2">
     <w:abstractNumId w:val="0"/>
   </w:num>
   <w:num w:numId="3">
-    <w:abstractNumId w:val="9"/>
+    <w:abstractNumId w:val="10"/>
   </w:num>
   <w:num w:numId="4">
     <w:abstractNumId w:val="2"/>
@@ -1257,13 +1483,13 @@
     <w:abstractNumId w:val="1"/>
   </w:num>
   <w:num w:numId="6">
-    <w:abstractNumId w:val="6"/>
+    <w:abstractNumId w:val="7"/>
   </w:num>
   <w:num w:numId="7">
-    <w:abstractNumId w:val="4"/>
+    <w:abstractNumId w:val="5"/>
   </w:num>
   <w:num w:numId="8">
-    <w:abstractNumId w:val="5"/>
+    <w:abstractNumId w:val="6"/>
   </w:num>
   <w:num w:numId="9">
     <w:abstractNumId w:val="2"/>
@@ -1278,7 +1504,7 @@
     </w:lvlOverride>
   </w:num>
   <w:num w:numId="11">
-    <w:abstractNumId w:val="7"/>
+    <w:abstractNumId w:val="8"/>
   </w:num>
   <w:num w:numId="12">
     <w:abstractNumId w:val="2"/>
@@ -1287,6 +1513,9 @@
     </w:lvlOverride>
   </w:num>
   <w:num w:numId="13">
+    <w:abstractNumId w:val="4"/>
+  </w:num>
+  <w:num w:numId="14">
     <w:abstractNumId w:val="3"/>
   </w:num>
 </w:numbering>
@@ -1448,7 +1677,10 @@
     <w:lsdException w:name="Table Subtle 1" w:semiHidden="1" w:unhideWhenUsed="1"/>
     <w:lsdException w:name="Table Subtle 2" w:semiHidden="1" w:unhideWhenUsed="1"/>
     <w:lsdException w:name="Table Web 1" w:semiHidden="1" w:unhideWhenUsed="1"/>
+    <w:lsdException w:name="Table Web 2" w:semiHidden="1" w:unhideWhenUsed="1"/>
+    <w:lsdException w:name="Table Web 3" w:semiHidden="1" w:unhideWhenUsed="1"/>
     <w:lsdException w:name="Table Grid" w:uiPriority="39"/>
+    <w:lsdException w:name="Table Theme" w:semiHidden="1" w:unhideWhenUsed="1"/>
     <w:lsdException w:name="Placeholder Text" w:semiHidden="1" w:uiPriority="99"/>
     <w:lsdException w:name="No Spacing" w:uiPriority="1" w:qFormat="1"/>
     <w:lsdException w:name="Light Shading" w:uiPriority="60"/>

</xml_diff>